<commit_message>
Registrada la tutoria del martes en la bitacora, con la pregunta del docente y lo que quedo pendiente
</commit_message>
<xml_diff>
--- a/docs/21_PREGUNTAS_PARA_LA_TUTORIA.docx
+++ b/docs/21_PREGUNTAS_PARA_LA_TUTORIA.docx
@@ -1256,6 +1256,114 @@
         <w:t>Firma de conformidad del tutor sobre los acuerdos: ______________________________</w:t>
       </w:r>
     </w:p>
+    <w:p>
+      <w:r>
+        <w:rPr>
+          <w:b w:val="0"/>
+          <w:color w:val="555555"/>
+          <w:sz w:val="18"/>
+        </w:rPr>
+        <w:t>____________________________________________________________</w:t>
+      </w:r>
+    </w:p>
+    <w:p>
+      <w:pPr>
+        <w:pStyle w:val="Heading1"/>
+      </w:pPr>
+      <w:r>
+        <w:t>Después de la sesión (martes 29, 21:30)</w:t>
+      </w:r>
+    </w:p>
+    <w:p>
+      <w:r>
+        <w:rPr>
+          <w:b w:val="0"/>
+          <w:sz w:val="22"/>
+        </w:rPr>
+        <w:t>La tutoría fue corta: alcanzó para mostrar el sistema y para unas pocas consultas. El docente</w:t>
+      </w:r>
+    </w:p>
+    <w:p>
+      <w:r>
+        <w:rPr>
+          <w:b w:val="0"/>
+          <w:sz w:val="22"/>
+        </w:rPr>
+        <w:t>dijo que el trabajo está bien y no planteó dudas nuevas. La única pregunta que hizo fue:</w:t>
+      </w:r>
+    </w:p>
+    <w:p>
+      <w:r>
+        <w:rPr>
+          <w:b w:val="0"/>
+          <w:sz w:val="22"/>
+        </w:rPr>
+        <w:t>&gt; «¿Cómo está conectado el módulo ESP32 con Firestore?» → *A través del servicio: el módulo</w:t>
+      </w:r>
+    </w:p>
+    <w:p>
+      <w:r>
+        <w:rPr>
+          <w:b w:val="0"/>
+          <w:sz w:val="22"/>
+        </w:rPr>
+        <w:t>&gt; publica por HTTPS con su clave de dispositivo, el servicio valida y escribe en la base, y nadie</w:t>
+      </w:r>
+    </w:p>
+    <w:p>
+      <w:r>
+        <w:rPr>
+          <w:b w:val="0"/>
+          <w:sz w:val="22"/>
+        </w:rPr>
+        <w:t>&gt; toca Firestore directamente.*</w:t>
+      </w:r>
+    </w:p>
+    <w:p>
+      <w:r>
+        <w:rPr>
+          <w:b w:val="0"/>
+          <w:sz w:val="22"/>
+        </w:rPr>
+        <w:t>Quedaron sin responder las cuatro del primer bloque: A-11, A-12, A-4 y el número de detecciones</w:t>
+      </w:r>
+    </w:p>
+    <w:p>
+      <w:r>
+        <w:rPr>
+          <w:b w:val="0"/>
+          <w:sz w:val="22"/>
+        </w:rPr>
+        <w:t>tardías. Como la próxima tutoría puede volver a quedarse corta, se pasan por escrito, en un solo</w:t>
+      </w:r>
+    </w:p>
+    <w:p>
+      <w:r>
+        <w:rPr>
+          <w:b w:val="0"/>
+          <w:sz w:val="22"/>
+        </w:rPr>
+        <w:t>mensaje, y se agrega la pregunta por el día y hora de la próxima sesión.</w:t>
+      </w:r>
+    </w:p>
+    <w:p>
+      <w:r>
+        <w:rPr>
+          <w:b w:val="0"/>
+          <w:sz w:val="22"/>
+        </w:rPr>
+        <w:t>Antes de eso, conviene revisar el documento devuelto del T3: si A-11 y A-12 quedaron como</w:t>
+      </w:r>
+    </w:p>
+    <w:p>
+      <w:r>
+        <w:rPr>
+          <w:b w:val="0"/>
+          <w:sz w:val="22"/>
+        </w:rPr>
+        <w:t>comentarios dentro del archivo, están ahí y no hay que esperar respuesta.</w:t>
+      </w:r>
+    </w:p>
     <w:sectPr>
       <w:pgSz w:w="12240" w:h="15840"/>
       <w:pgMar w:top="1440" w:right="1800" w:bottom="1440" w:left="1800" w:header="720" w:footer="720" w:gutter="0"/>

</xml_diff>